<commit_message>
State plainly that the product form of the rate law is an assumption
Methods 2.2 derived each factor of the rate law from a separate published
source but never said what combining them as a product assumes, which left the
one unsourced structural choice in the model unmarked.

It now says so: each factor is attributed to its own source, and the product
form is named as a modelling choice that treats the steps as independent and
sequential, with the case that would break it (tandem MutSbeta binding altering
slip-out probability at a neighbouring site) stated rather than left implicit.

Limitations gains a matching entry. The point it makes is that an exact fit to
four anchors is weak evidence for the algebra, since a different combination
rule with its own four free parameters would likely fit them too; what the data
constrain is the shape of the length dependence, not the form that produces it.
</commit_message>
<xml_diff>
--- a/dist/Huntington_somatic_expansion_model.docx
+++ b/dist/Huntington_somatic_expansion_model.docx
@@ -925,7 +925,15 @@
         <w:pStyle w:val="FirstParagraph"/>
       </w:pPr>
       <w:r>
-        <w:t xml:space="preserve">Each factor corresponds to a step in the mechanism described in section 1.3.</w:t>
+        <w:t xml:space="preserve">Each factor corresponds to a step in the mechanism described in section 1.3, and each is sourced separately: the footprint from structural work [3], the slip-out equilibrium from polymer thermodynamics, the clustering penalty from the in vitro repair assays [6], and the MSH3 and FAN1 terms from the genetics and the mouse dose-response [4,5].</w:t>
+      </w:r>
+    </w:p>
+    <w:p>
+      <w:pPr>
+        <w:pStyle w:val="BodyText"/>
+      </w:pPr>
+      <w:r>
+        <w:t xml:space="preserve">Combining them as a product is a modelling choice rather than a published result, and it is the one piece of this structure with no direct support. It treats the steps as independent stages of a single pathway, so that the rate of a productive event is the product of the chances of each stage. That is reasonable if the stages really are sequential and non-interacting. It would be wrong if, for example, MutSβ bound at one site altered the slip-out probability at a neighbouring one, which tandem binding [3] makes conceivable. No available dataset separates these possibilities, so the product form is carried as an explicit structural assumption and named as such in the limitations.</w:t>
       </w:r>
     </w:p>
     <w:p>
@@ -7182,6 +7190,28 @@
       </w:r>
       <w:r>
         <w:t xml:space="preserve">Every calibration target is a published summary statistic, and several of them are themselves model-derived. The transit times in [1] come from a simulation rather than from longitudinal measurement of single cells, so this model inherits the assumptions of that one.</w:t>
+      </w:r>
+    </w:p>
+    <w:p>
+      <w:pPr>
+        <w:numPr>
+          <w:ilvl w:val="0"/>
+          <w:numId w:val="1004"/>
+        </w:numPr>
+        <w:pStyle w:val="Compact"/>
+      </w:pPr>
+      <w:r>
+        <w:rPr>
+          <w:bCs/>
+          <w:b/>
+        </w:rPr>
+        <w:t xml:space="preserve">The functional form of the rate law is assumed.</w:t>
+      </w:r>
+      <w:r>
+        <w:t xml:space="preserve"> </w:t>
+      </w:r>
+      <w:r>
+        <w:t xml:space="preserve">Each factor in λ(L) is sourced, but writing them as a product is not: it assumes the steps are independent and sequential. The fit cannot test that assumption, because a different combination rule with its own four free parameters would very likely also reproduce four anchors. What the data constrain is the shape of the length dependence, not the algebra that produces it.</w:t>
       </w:r>
     </w:p>
     <w:p>

</xml_diff>